<commit_message>
Improve report template layout and align guidance
</commit_message>
<xml_diff>
--- a/PROJECT/workspace/template/report_template.docx
+++ b/PROJECT/workspace/template/report_template.docx
@@ -1,111 +1,95 @@
 
 <file path=word/document.xml><?xml version="1.0" encoding="utf-8"?>
-<w:document xmlns:w="http://schemas.openxmlformats.org/wordprocessingml/2006/main" xmlns:m="http://schemas.openxmlformats.org/officeDocument/2006/math" xmlns:r="http://schemas.openxmlformats.org/officeDocument/2006/relationships" xmlns:o="urn:schemas-microsoft-com:office:office" xmlns:v="urn:schemas-microsoft-com:vml" xmlns:w10="urn:schemas-microsoft-com:office:word" xmlns:a="http://schemas.openxmlformats.org/drawingml/2006/main" xmlns:pic="http://schemas.openxmlformats.org/drawingml/2006/picture" xmlns:wp="http://schemas.openxmlformats.org/drawingml/2006/wordprocessingDrawing">
+<w:document xmlns:w="http://schemas.openxmlformats.org/wordprocessingml/2006/main">
   <w:body>
-    <w:p>
-      <w:pPr>
-        <w:pStyle w:val="BlockText"/>
+    <w:bookmarkStart w:id="34" w:name="X0b33a5285d2d1b659549bc56d7fe36abed5f5d5"/>
+    <w:p>
+      <w:pPr>
+        <w:pStyle w:val="Title"/>
+      </w:pPr>
+      <w:r>
+        <w:t xml:space="preserve">Your title: concession and modelling question</w:t>
+      </w:r>
+    </w:p>
+    <w:p>
+      <w:pPr>
+        <w:pStyle w:val="FirstParagraph"/>
       </w:pPr>
       <w:r>
         <w:rPr>
           <w:bCs/>
           <w:b/>
         </w:rPr>
-        <w:t xml:space="preserve">GUIDANCE — delete this block.</w:t>
-      </w:r>
-      <w:r>
-        <w:t xml:space="preserve"> </w:t>
+        <w:t xml:space="preserve">Group</w:t>
       </w:r>
       <w:r>
         <w:rPr>
           <w:bCs/>
           <w:b/>
         </w:rPr>
-        <w:t xml:space="preserve">Group report template — Applied Groundwater Modelling.</w:t>
-      </w:r>
-      <w:r>
-        <w:t xml:space="preserve"> </w:t>
-      </w:r>
-      <w:r>
-        <w:t xml:space="preserve">Read</w:t>
-      </w:r>
-      <w:r>
-        <w:t xml:space="preserve"> </w:t>
-      </w:r>
-      <w:r>
-        <w:rPr>
-          <w:rStyle w:val="VerbatimChar"/>
-        </w:rPr>
-        <w:t xml:space="preserve">REPORT_BRIEF.md</w:t>
-      </w:r>
-      <w:r>
-        <w:t xml:space="preserve"> </w:t>
-      </w:r>
-      <w:r>
-        <w:t xml:space="preserve">first: it says what each section is FOR and how it is judged.</w:t>
-      </w:r>
-      <w:r>
-        <w:t xml:space="preserve"> </w:t>
-      </w:r>
-      <w:r>
-        <w:t xml:space="preserve">This file is only the skeleton.</w:t>
-      </w:r>
-    </w:p>
-    <w:p>
-      <w:pPr>
-        <w:pStyle w:val="BlockText"/>
-      </w:pPr>
-      <w:r>
-        <w:rPr>
+        <w:t xml:space="preserve"> </w:t>
+      </w:r>
+      <w:r>
+        <w:rPr>
+          <w:rStyle w:val="VerbatimChar"/>
           <w:bCs/>
           <w:b/>
         </w:rPr>
-        <w:t xml:space="preserve">Same skeleton in three formats — pick one, they are equivalent:</w:t>
-      </w:r>
-      <w:r>
-        <w:t xml:space="preserve"> </w:t>
-      </w:r>
-      <w:r>
-        <w:rPr>
-          <w:rStyle w:val="VerbatimChar"/>
-        </w:rPr>
-        <w:t xml:space="preserve">report_template.md</w:t>
-      </w:r>
-      <w:r>
-        <w:t xml:space="preserve"> </w:t>
-      </w:r>
-      <w:r>
-        <w:t xml:space="preserve">(JupyterHub, VS Code, any editor) ·</w:t>
-      </w:r>
-      <w:r>
-        <w:t xml:space="preserve"> </w:t>
-      </w:r>
-      <w:r>
-        <w:rPr>
-          <w:rStyle w:val="VerbatimChar"/>
-        </w:rPr>
-        <w:t xml:space="preserve">report_template.tex</w:t>
-      </w:r>
-      <w:r>
-        <w:t xml:space="preserve"> </w:t>
-      </w:r>
-      <w:r>
-        <w:t xml:space="preserve">(LaTeX / Overleaf) ·</w:t>
-      </w:r>
-      <w:r>
-        <w:t xml:space="preserve"> </w:t>
-      </w:r>
-      <w:r>
-        <w:rPr>
-          <w:rStyle w:val="VerbatimChar"/>
-        </w:rPr>
-        <w:t xml:space="preserve">report_template.docx</w:t>
-      </w:r>
-      <w:r>
-        <w:t xml:space="preserve"> </w:t>
-      </w:r>
-      <w:r>
-        <w:t xml:space="preserve">(Microsoft Word).</w:t>
+        <w:t xml:space="preserve">&lt;N&gt;</w:t>
+      </w:r>
+      <w:r>
+        <w:t xml:space="preserve"> </w:t>
+      </w:r>
+      <w:r>
+        <w:t xml:space="preserve">·</w:t>
+      </w:r>
+      <w:r>
+        <w:t xml:space="preserve"> </w:t>
+      </w:r>
+      <w:r>
+        <w:rPr>
+          <w:rStyle w:val="VerbatimChar"/>
+        </w:rPr>
+        <w:t xml:space="preserve">&lt;First Last&gt;</w:t>
+      </w:r>
+      <w:r>
+        <w:t xml:space="preserve">,</w:t>
+      </w:r>
+      <w:r>
+        <w:t xml:space="preserve"> </w:t>
+      </w:r>
+      <w:r>
+        <w:rPr>
+          <w:rStyle w:val="VerbatimChar"/>
+        </w:rPr>
+        <w:t xml:space="preserve">&lt;First Last&gt;</w:t>
+      </w:r>
+      <w:r>
+        <w:t xml:space="preserve">,</w:t>
+      </w:r>
+      <w:r>
+        <w:t xml:space="preserve"> </w:t>
+      </w:r>
+      <w:r>
+        <w:rPr>
+          <w:rStyle w:val="VerbatimChar"/>
+        </w:rPr>
+        <w:t xml:space="preserve">&lt;First Last&gt;</w:t>
+      </w:r>
+      <w:r>
+        <w:br/>
+      </w:r>
+      <w:r>
+        <w:t xml:space="preserve">Applied Groundwater Modelling ·</w:t>
+      </w:r>
+      <w:r>
+        <w:t xml:space="preserve"> </w:t>
+      </w:r>
+      <w:r>
+        <w:rPr>
+          <w:rStyle w:val="VerbatimChar"/>
+        </w:rPr>
+        <w:t xml:space="preserve">&lt;date&gt;</w:t>
       </w:r>
     </w:p>
     <w:p>
@@ -117,148 +101,101 @@
           <w:bCs/>
           <w:b/>
         </w:rPr>
-        <w:t xml:space="preserve">How to use.</w:t>
-      </w:r>
-      <w:r>
-        <w:t xml:space="preserve"> </w:t>
-      </w:r>
-      <w:r>
-        <w:t xml:space="preserve">Copy your chosen file into your group folder as</w:t>
-      </w:r>
-      <w:r>
-        <w:t xml:space="preserve"> </w:t>
-      </w:r>
-      <w:r>
-        <w:rPr>
-          <w:rStyle w:val="VerbatimChar"/>
-        </w:rPr>
-        <w:t xml:space="preserve">report.md</w:t>
-      </w:r>
-      <w:r>
-        <w:t xml:space="preserve">,</w:t>
-      </w:r>
-      <w:r>
-        <w:t xml:space="preserve"> </w:t>
-      </w:r>
-      <w:r>
-        <w:rPr>
-          <w:rStyle w:val="VerbatimChar"/>
-        </w:rPr>
-        <w:t xml:space="preserve">report.tex</w:t>
-      </w:r>
-      <w:r>
-        <w:t xml:space="preserve"> </w:t>
-      </w:r>
-      <w:r>
-        <w:t xml:space="preserve">or</w:t>
-      </w:r>
-      <w:r>
-        <w:t xml:space="preserve"> </w:t>
-      </w:r>
-      <w:r>
-        <w:rPr>
-          <w:rStyle w:val="VerbatimChar"/>
-        </w:rPr>
-        <w:t xml:space="preserve">report.docx</w:t>
-      </w:r>
-      <w:r>
-        <w:t xml:space="preserve">. Delete each grey GUIDANCE block as you fill that section in — they are</w:t>
-      </w:r>
-      <w:r>
-        <w:t xml:space="preserve"> </w:t>
-      </w:r>
-      <w:r>
-        <w:t xml:space="preserve">instructions, not content. Then export to</w:t>
-      </w:r>
-      <w:r>
-        <w:t xml:space="preserve"> </w:t>
-      </w:r>
-      <w:r>
-        <w:rPr>
-          <w:rStyle w:val="VerbatimChar"/>
+        <w:t xml:space="preserve">GUIDANCE — delete this block.</w:t>
+      </w:r>
+      <w:r>
+        <w:t xml:space="preserve"> </w:t>
+      </w:r>
+      <w:r>
+        <w:rPr>
           <w:bCs/>
           <w:b/>
         </w:rPr>
-        <w:t xml:space="preserve">report.pdf</w:t>
-      </w:r>
-      <w:r>
-        <w:t xml:space="preserve"> </w:t>
-      </w:r>
-      <w:r>
-        <w:t xml:space="preserve">in your group folder root:</w:t>
-      </w:r>
-      <w:r>
-        <w:t xml:space="preserve"> </w:t>
-      </w:r>
-      <w:r>
-        <w:t xml:space="preserve">print to PDF from Word, hit Recompile in Overleaf, or from Markdown run</w:t>
-      </w:r>
-      <w:r>
-        <w:t xml:space="preserve"> </w:t>
-      </w:r>
-      <w:r>
-        <w:rPr>
-          <w:rStyle w:val="VerbatimChar"/>
-        </w:rPr>
-        <w:t xml:space="preserve">pandoc report.md -o report.pdf</w:t>
-      </w:r>
-      <w:r>
-        <w:t xml:space="preserve"> </w:t>
-      </w:r>
-      <w:r>
-        <w:t xml:space="preserve">—</w:t>
-      </w:r>
-      <w:r>
-        <w:t xml:space="preserve"> </w:t>
-      </w:r>
+        <w:t xml:space="preserve">Group report template — Applied Groundwater Modelling.</w:t>
+      </w:r>
+      <w:r>
+        <w:t xml:space="preserve"> </w:t>
+      </w:r>
+      <w:r>
+        <w:t xml:space="preserve">Read</w:t>
+      </w:r>
+      <w:r>
+        <w:t xml:space="preserve"> </w:t>
+      </w:r>
+      <w:r>
+        <w:rPr>
+          <w:rStyle w:val="VerbatimChar"/>
+        </w:rPr>
+        <w:t xml:space="preserve">REPORT_BRIEF.md</w:t>
+      </w:r>
+      <w:r>
+        <w:t xml:space="preserve"> </w:t>
+      </w:r>
+      <w:r>
+        <w:t xml:space="preserve">first: it says what each section is FOR and how it is judged.</w:t>
+      </w:r>
+      <w:r>
+        <w:t xml:space="preserve"> </w:t>
+      </w:r>
+      <w:r>
+        <w:t xml:space="preserve">This file is only the skeleton.</w:t>
+      </w:r>
+    </w:p>
+    <w:p>
+      <w:pPr>
+        <w:pStyle w:val="BlockText"/>
+      </w:pPr>
       <w:r>
         <w:rPr>
           <w:bCs/>
           <w:b/>
         </w:rPr>
-        <w:t xml:space="preserve">this works on the course JupyterHub</w:t>
-      </w:r>
-      <w:r>
-        <w:t xml:space="preserve">, which has</w:t>
-      </w:r>
-      <w:r>
-        <w:t xml:space="preserve"> </w:t>
-      </w:r>
-      <w:r>
-        <w:t xml:space="preserve">pandoc and LaTeX installed. On your own laptop it needs a LaTeX engine; if you get</w:t>
-      </w:r>
-      <w:r>
-        <w:t xml:space="preserve"> </w:t>
-      </w:r>
-      <w:r>
-        <w:rPr>
-          <w:rStyle w:val="VerbatimChar"/>
-        </w:rPr>
-        <w:t xml:space="preserve">pdflatex not found</w:t>
-      </w:r>
-      <w:r>
-        <w:t xml:space="preserve">, run</w:t>
-      </w:r>
-      <w:r>
-        <w:t xml:space="preserve"> </w:t>
-      </w:r>
-      <w:r>
-        <w:rPr>
-          <w:rStyle w:val="VerbatimChar"/>
-        </w:rPr>
-        <w:t xml:space="preserve">pandoc report.md -o report.docx</w:t>
-      </w:r>
-      <w:r>
-        <w:t xml:space="preserve"> </w:t>
-      </w:r>
-      <w:r>
-        <w:t xml:space="preserve">instead and print to PDF</w:t>
-      </w:r>
-      <w:r>
-        <w:t xml:space="preserve"> </w:t>
-      </w:r>
-      <w:r>
-        <w:t xml:space="preserve">from Word.</w:t>
+        <w:t xml:space="preserve">Same skeleton in three formats — pick one, they are equivalent:</w:t>
+      </w:r>
+      <w:r>
+        <w:t xml:space="preserve"> </w:t>
+      </w:r>
+      <w:r>
+        <w:rPr>
+          <w:rStyle w:val="VerbatimChar"/>
+        </w:rPr>
+        <w:t xml:space="preserve">report_template.md</w:t>
+      </w:r>
+      <w:r>
+        <w:t xml:space="preserve"> </w:t>
+      </w:r>
+      <w:r>
+        <w:t xml:space="preserve">(JupyterHub, VS Code, any editor) ·</w:t>
+      </w:r>
+      <w:r>
+        <w:t xml:space="preserve"> </w:t>
+      </w:r>
+      <w:r>
+        <w:rPr>
+          <w:rStyle w:val="VerbatimChar"/>
+        </w:rPr>
+        <w:t xml:space="preserve">report_template.tex</w:t>
+      </w:r>
+      <w:r>
+        <w:t xml:space="preserve"> </w:t>
+      </w:r>
+      <w:r>
+        <w:t xml:space="preserve">(LaTeX / Overleaf) ·</w:t>
+      </w:r>
+      <w:r>
+        <w:t xml:space="preserve"> </w:t>
+      </w:r>
+      <w:r>
+        <w:rPr>
+          <w:rStyle w:val="VerbatimChar"/>
+        </w:rPr>
+        <w:t xml:space="preserve">report_template.docx</w:t>
+      </w:r>
+      <w:r>
+        <w:t xml:space="preserve"> </w:t>
+      </w:r>
+      <w:r>
+        <w:t xml:space="preserve">(Microsoft Word).</w:t>
       </w:r>
     </w:p>
     <w:p>
@@ -270,134 +207,178 @@
           <w:bCs/>
           <w:b/>
         </w:rPr>
-        <w:t xml:space="preserve">Limits.</w:t>
-      </w:r>
-      <w:r>
-        <w:t xml:space="preserve"> </w:t>
-      </w:r>
-      <w:r>
-        <w:t xml:space="preserve">10 pages max, excluding this title block, references and appendix.</w:t>
-      </w:r>
-      <w:r>
-        <w:t xml:space="preserve"> </w:t>
-      </w:r>
-      <w:r>
-        <w:t xml:space="preserve">Appendix capped at 5 pages. The per-section budgets below add to about 8, which leaves</w:t>
-      </w:r>
-      <w:r>
-        <w:t xml:space="preserve"> </w:t>
-      </w:r>
-      <w:r>
-        <w:t xml:space="preserve">you room — they are guides, not rules.</w:t>
-      </w:r>
-    </w:p>
-    <w:bookmarkStart w:id="34" w:name="Xa5540b7a2a753f73218342ccd03bcb6dbeb4581"/>
-    <w:p>
-      <w:pPr>
-        <w:pStyle w:val="Heading1"/>
-      </w:pPr>
-      <w:r>
-        <w:rPr>
-          <w:rStyle w:val="VerbatimChar"/>
-        </w:rPr>
-        <w:t xml:space="preserve">&lt;Your title — name the concession and the question, not "Groundwater Modelling Report"&gt;</w:t>
-      </w:r>
-    </w:p>
-    <w:p>
-      <w:pPr>
-        <w:pStyle w:val="FirstParagraph"/>
-      </w:pPr>
-      <w:r>
-        <w:rPr>
+        <w:t xml:space="preserve">How to use.</w:t>
+      </w:r>
+      <w:r>
+        <w:t xml:space="preserve"> </w:t>
+      </w:r>
+      <w:r>
+        <w:t xml:space="preserve">Copy your chosen file into your group folder as</w:t>
+      </w:r>
+      <w:r>
+        <w:t xml:space="preserve"> </w:t>
+      </w:r>
+      <w:r>
+        <w:rPr>
+          <w:rStyle w:val="VerbatimChar"/>
+        </w:rPr>
+        <w:t xml:space="preserve">report.md</w:t>
+      </w:r>
+      <w:r>
+        <w:t xml:space="preserve">,</w:t>
+      </w:r>
+      <w:r>
+        <w:t xml:space="preserve"> </w:t>
+      </w:r>
+      <w:r>
+        <w:rPr>
+          <w:rStyle w:val="VerbatimChar"/>
+        </w:rPr>
+        <w:t xml:space="preserve">report.tex</w:t>
+      </w:r>
+      <w:r>
+        <w:t xml:space="preserve"> </w:t>
+      </w:r>
+      <w:r>
+        <w:t xml:space="preserve">or</w:t>
+      </w:r>
+      <w:r>
+        <w:t xml:space="preserve"> </w:t>
+      </w:r>
+      <w:r>
+        <w:rPr>
+          <w:rStyle w:val="VerbatimChar"/>
+        </w:rPr>
+        <w:t xml:space="preserve">report.docx</w:t>
+      </w:r>
+      <w:r>
+        <w:t xml:space="preserve">. Delete each GUIDANCE block as you fill that section in — they are</w:t>
+      </w:r>
+      <w:r>
+        <w:t xml:space="preserve"> </w:t>
+      </w:r>
+      <w:r>
+        <w:t xml:space="preserve">instructions, not content. Then export to</w:t>
+      </w:r>
+      <w:r>
+        <w:t xml:space="preserve"> </w:t>
+      </w:r>
+      <w:r>
+        <w:rPr>
+          <w:rStyle w:val="VerbatimChar"/>
           <w:bCs/>
           <w:b/>
         </w:rPr>
-        <w:t xml:space="preserve">Group</w:t>
+        <w:t xml:space="preserve">report.pdf</w:t>
+      </w:r>
+      <w:r>
+        <w:t xml:space="preserve"> </w:t>
+      </w:r>
+      <w:r>
+        <w:t xml:space="preserve">in your group folder root:</w:t>
+      </w:r>
+      <w:r>
+        <w:t xml:space="preserve"> </w:t>
+      </w:r>
+      <w:r>
+        <w:t xml:space="preserve">print to PDF from Word, hit Recompile in Overleaf, or from Markdown run</w:t>
+      </w:r>
+      <w:r>
+        <w:t xml:space="preserve"> </w:t>
+      </w:r>
+      <w:r>
+        <w:rPr>
+          <w:rStyle w:val="VerbatimChar"/>
+        </w:rPr>
+        <w:t xml:space="preserve">pandoc report.md -o report.pdf</w:t>
+      </w:r>
+      <w:r>
+        <w:t xml:space="preserve"> </w:t>
+      </w:r>
+      <w:r>
+        <w:t xml:space="preserve">—</w:t>
+      </w:r>
+      <w:r>
+        <w:t xml:space="preserve"> </w:t>
       </w:r>
       <w:r>
         <w:rPr>
           <w:bCs/>
           <w:b/>
         </w:rPr>
-        <w:t xml:space="preserve"> </w:t>
-      </w:r>
-      <w:r>
-        <w:rPr>
-          <w:rStyle w:val="VerbatimChar"/>
+        <w:t xml:space="preserve">this works on the course JupyterHub</w:t>
+      </w:r>
+      <w:r>
+        <w:t xml:space="preserve">, which has</w:t>
+      </w:r>
+      <w:r>
+        <w:t xml:space="preserve"> </w:t>
+      </w:r>
+      <w:r>
+        <w:t xml:space="preserve">pandoc and LaTeX installed. On your own laptop it needs a LaTeX engine; if you get</w:t>
+      </w:r>
+      <w:r>
+        <w:t xml:space="preserve"> </w:t>
+      </w:r>
+      <w:r>
+        <w:rPr>
+          <w:rStyle w:val="VerbatimChar"/>
+        </w:rPr>
+        <w:t xml:space="preserve">pdflatex not found</w:t>
+      </w:r>
+      <w:r>
+        <w:t xml:space="preserve">, run</w:t>
+      </w:r>
+      <w:r>
+        <w:t xml:space="preserve"> </w:t>
+      </w:r>
+      <w:r>
+        <w:rPr>
+          <w:rStyle w:val="VerbatimChar"/>
+        </w:rPr>
+        <w:t xml:space="preserve">pandoc report.md -o report.docx</w:t>
+      </w:r>
+      <w:r>
+        <w:t xml:space="preserve"> </w:t>
+      </w:r>
+      <w:r>
+        <w:t xml:space="preserve">instead and print to PDF</w:t>
+      </w:r>
+      <w:r>
+        <w:t xml:space="preserve"> </w:t>
+      </w:r>
+      <w:r>
+        <w:t xml:space="preserve">from Word.</w:t>
+      </w:r>
+    </w:p>
+    <w:p>
+      <w:pPr>
+        <w:pStyle w:val="BlockText"/>
+      </w:pPr>
+      <w:r>
+        <w:rPr>
           <w:bCs/>
           <w:b/>
         </w:rPr>
-        <w:t xml:space="preserve">&lt;N&gt;</w:t>
-      </w:r>
-      <w:r>
-        <w:t xml:space="preserve"> </w:t>
-      </w:r>
-      <w:r>
-        <w:t xml:space="preserve">·</w:t>
-      </w:r>
-      <w:r>
-        <w:t xml:space="preserve"> </w:t>
-      </w:r>
-      <w:r>
-        <w:rPr>
-          <w:rStyle w:val="VerbatimChar"/>
-        </w:rPr>
-        <w:t xml:space="preserve">&lt;First Last&gt;</w:t>
-      </w:r>
-      <w:r>
-        <w:t xml:space="preserve">,</w:t>
-      </w:r>
-      <w:r>
-        <w:t xml:space="preserve"> </w:t>
-      </w:r>
-      <w:r>
-        <w:rPr>
-          <w:rStyle w:val="VerbatimChar"/>
-        </w:rPr>
-        <w:t xml:space="preserve">&lt;First Last&gt;</w:t>
-      </w:r>
-      <w:r>
-        <w:t xml:space="preserve">,</w:t>
-      </w:r>
-      <w:r>
-        <w:t xml:space="preserve"> </w:t>
-      </w:r>
-      <w:r>
-        <w:rPr>
-          <w:rStyle w:val="VerbatimChar"/>
-        </w:rPr>
-        <w:t xml:space="preserve">&lt;First Last&gt;</w:t>
-      </w:r>
-      <w:r>
-        <w:t xml:space="preserve"> </w:t>
-      </w:r>
-      <w:r>
-        <w:t xml:space="preserve">Applied Groundwater Modelling ·</w:t>
-      </w:r>
-      <w:r>
-        <w:t xml:space="preserve"> </w:t>
-      </w:r>
-      <w:r>
-        <w:rPr>
-          <w:rStyle w:val="VerbatimChar"/>
-        </w:rPr>
-        <w:t xml:space="preserve">&lt;date&gt;</w:t>
-      </w:r>
-    </w:p>
-    <w:p>
-      <w:r>
-        <w:pict>
-          <v:rect style="width:0;height:1.5pt" o:hralign="center" o:hrstd="t" o:hr="t"/>
-        </w:pict>
-      </w:r>
-    </w:p>
-    <w:bookmarkStart w:id="20" w:name="problem-and-modelling-question"/>
-    <w:p>
-      <w:pPr>
-        <w:pStyle w:val="Heading2"/>
-      </w:pPr>
-      <w:r>
-        <w:t xml:space="preserve">1. Problem and modelling question</w:t>
+        <w:t xml:space="preserve">Layout.</w:t>
+      </w:r>
+      <w:r>
+        <w:t xml:space="preserve"> </w:t>
+      </w:r>
+      <w:r>
+        <w:t xml:space="preserve">You may adjust fonts, spacing and figure placement to suit your report.</w:t>
+      </w:r>
+      <w:r>
+        <w:t xml:space="preserve"> </w:t>
+      </w:r>
+      <w:r>
+        <w:t xml:space="preserve">Keep the required sections, readable text and the page limits. The supplied layout</w:t>
+      </w:r>
+      <w:r>
+        <w:t xml:space="preserve"> </w:t>
+      </w:r>
+      <w:r>
+        <w:t xml:space="preserve">is a starting point, not an assessment criterion.</w:t>
       </w:r>
     </w:p>
     <w:p>
@@ -409,6 +390,45 @@
           <w:bCs/>
           <w:b/>
         </w:rPr>
+        <w:t xml:space="preserve">Limits.</w:t>
+      </w:r>
+      <w:r>
+        <w:t xml:space="preserve"> </w:t>
+      </w:r>
+      <w:r>
+        <w:t xml:space="preserve">10 pages max, excluding this title block, references and appendix.</w:t>
+      </w:r>
+      <w:r>
+        <w:t xml:space="preserve"> </w:t>
+      </w:r>
+      <w:r>
+        <w:t xml:space="preserve">Appendix capped at 5 pages. The per-section budgets below add to about 8, which leaves</w:t>
+      </w:r>
+      <w:r>
+        <w:t xml:space="preserve"> </w:t>
+      </w:r>
+      <w:r>
+        <w:t xml:space="preserve">you room — they are guides, not rules.</w:t>
+      </w:r>
+    </w:p>
+    <w:bookmarkStart w:id="20" w:name="problem-and-modelling-question"/>
+    <w:p>
+      <w:pPr>
+        <w:pStyle w:val="Heading1"/>
+      </w:pPr>
+      <w:r>
+        <w:t xml:space="preserve">1. Problem and modelling question</w:t>
+      </w:r>
+    </w:p>
+    <w:p>
+      <w:pPr>
+        <w:pStyle w:val="BlockText"/>
+      </w:pPr>
+      <w:r>
+        <w:rPr>
+          <w:bCs/>
+          <w:b/>
+        </w:rPr>
         <w:t xml:space="preserve">GUIDANCE — delete this block.</w:t>
       </w:r>
       <w:r>
@@ -487,7 +507,7 @@
     <w:bookmarkStart w:id="22" w:name="conceptual-model-and-assumptions"/>
     <w:p>
       <w:pPr>
-        <w:pStyle w:val="Heading2"/>
+        <w:pStyle w:val="Heading1"/>
       </w:pPr>
       <w:r>
         <w:t xml:space="preserve">2. Conceptual model and assumptions</w:t>
@@ -567,7 +587,7 @@
     <w:bookmarkStart w:id="21" w:name="assumptions-and-their-consequences"/>
     <w:p>
       <w:pPr>
-        <w:pStyle w:val="Heading3"/>
+        <w:pStyle w:val="Heading2"/>
       </w:pPr>
       <w:r>
         <w:t xml:space="preserve">2.1 Assumptions and their consequences</w:t>
@@ -579,6 +599,20 @@
         <w:tblW w:type="auto" w:w="0"/>
         <w:tblLook w:firstRow="1" w:lastRow="0" w:firstColumn="0" w:lastColumn="0" w:noHBand="0" w:noVBand="0" w:val="0020"/>
         <w:jc w:val="start"/>
+        <w:tblBorders>
+          <w:top w:val="single" w:sz="4" w:color="D9D9D9"/>
+          <w:left w:val="single" w:sz="4" w:color="D9D9D9"/>
+          <w:bottom w:val="single" w:sz="4" w:color="D9D9D9"/>
+          <w:right w:val="single" w:sz="4" w:color="D9D9D9"/>
+          <w:insideH w:val="single" w:sz="4" w:color="D9D9D9"/>
+          <w:insideV w:val="single" w:sz="4" w:color="D9D9D9"/>
+        </w:tblBorders>
+        <w:tblCellMar>
+          <w:top w:w="90" w:type="dxa"/>
+          <w:bottom w:w="90" w:type="dxa"/>
+          <w:left w:w="90" w:type="dxa"/>
+          <w:right w:w="90" w:type="dxa"/>
+        </w:tblCellMar>
       </w:tblPr>
       <w:tblGrid>
         <w:gridCol w:w="2640"/>
@@ -588,13 +622,17 @@
       <w:tr>
         <w:trPr>
           <w:tblHeader w:val="true"/>
+          <w:cantSplit/>
         </w:trPr>
         <w:tc>
-          <w:tcPr/>
-          <w:p>
-            <w:pPr>
-              <w:pStyle w:val="Compact"/>
-              <w:jc w:val="left"/>
+          <w:tcPr>
+            <w:shd w:fill="EDEDED"/>
+          </w:tcPr>
+          <w:p>
+            <w:pPr>
+              <w:pStyle w:val="Compact"/>
+              <w:jc w:val="left"/>
+              <w:keepNext/>
             </w:pPr>
             <w:r>
               <w:t xml:space="preserve">Assumption</w:t>
@@ -602,11 +640,14 @@
           </w:p>
         </w:tc>
         <w:tc>
-          <w:tcPr/>
-          <w:p>
-            <w:pPr>
-              <w:pStyle w:val="Compact"/>
-              <w:jc w:val="left"/>
+          <w:tcPr>
+            <w:shd w:fill="EDEDED"/>
+          </w:tcPr>
+          <w:p>
+            <w:pPr>
+              <w:pStyle w:val="Compact"/>
+              <w:jc w:val="left"/>
+              <w:keepNext/>
             </w:pPr>
             <w:r>
               <w:t xml:space="preserve">Why it is reasonable here</w:t>
@@ -614,11 +655,14 @@
           </w:p>
         </w:tc>
         <w:tc>
-          <w:tcPr/>
-          <w:p>
-            <w:pPr>
-              <w:pStyle w:val="Compact"/>
-              <w:jc w:val="left"/>
+          <w:tcPr>
+            <w:shd w:fill="EDEDED"/>
+          </w:tcPr>
+          <w:p>
+            <w:pPr>
+              <w:pStyle w:val="Compact"/>
+              <w:jc w:val="left"/>
+              <w:keepNext/>
             </w:pPr>
             <w:r>
               <w:t xml:space="preserve">What it costs us</w:t>
@@ -633,6 +677,7 @@
             <w:pPr>
               <w:pStyle w:val="Compact"/>
               <w:jc w:val="left"/>
+              <w:keepNext/>
             </w:pPr>
             <w:r>
               <w:rPr>
@@ -648,6 +693,7 @@
             <w:pPr>
               <w:pStyle w:val="Compact"/>
               <w:jc w:val="left"/>
+              <w:keepNext/>
             </w:pPr>
             <w:r>
               <w:rPr>
@@ -663,6 +709,7 @@
             <w:pPr>
               <w:pStyle w:val="Compact"/>
               <w:jc w:val="left"/>
+              <w:keepNext/>
             </w:pPr>
             <w:r>
               <w:rPr>
@@ -672,6 +719,9 @@
             </w:r>
           </w:p>
         </w:tc>
+        <w:trPr>
+          <w:cantSplit/>
+        </w:trPr>
       </w:tr>
       <w:tr>
         <w:tc>
@@ -719,6 +769,9 @@
             </w:r>
           </w:p>
         </w:tc>
+        <w:trPr>
+          <w:cantSplit/>
+        </w:trPr>
       </w:tr>
     </w:tbl>
     <w:bookmarkEnd w:id="21"/>
@@ -726,7 +779,7 @@
     <w:bookmarkStart w:id="23" w:name="method"/>
     <w:p>
       <w:pPr>
-        <w:pStyle w:val="Heading2"/>
+        <w:pStyle w:val="Heading1"/>
       </w:pPr>
       <w:r>
         <w:t xml:space="preserve">3. Method</w:t>
@@ -783,7 +836,7 @@
     <w:bookmarkStart w:id="28" w:name="results"/>
     <w:p>
       <w:pPr>
-        <w:pStyle w:val="Heading2"/>
+        <w:pStyle w:val="Heading1"/>
       </w:pPr>
       <w:r>
         <w:t xml:space="preserve">4. Results</w:t>
@@ -829,6 +882,24 @@
       </w:r>
       <w:r>
         <w:t xml:space="preserve">verdict say TOGETHER about your concession.</w:t>
+      </w:r>
+      <w:r>
+        <w:t xml:space="preserve"> </w:t>
+      </w:r>
+      <w:r>
+        <w:t xml:space="preserve">Every member’s work must be visible in the integrated results. A finding usually</w:t>
+      </w:r>
+      <w:r>
+        <w:t xml:space="preserve"> </w:t>
+      </w:r>
+      <w:r>
+        <w:t xml:space="preserve">draws on more than one card: say whose analysis established it in the text or</w:t>
+      </w:r>
+      <w:r>
+        <w:t xml:space="preserve"> </w:t>
+      </w:r>
+      <w:r>
+        <w:t xml:space="preserve">caption, rather than giving each member a subsection.</w:t>
       </w:r>
       <w:r>
         <w:t xml:space="preserve"> </w:t>
@@ -926,6 +997,20 @@
         <w:tblW w:type="auto" w:w="0"/>
         <w:tblLook w:firstRow="1" w:lastRow="0" w:firstColumn="0" w:lastColumn="0" w:noHBand="0" w:noVBand="0" w:val="0020"/>
         <w:jc w:val="start"/>
+        <w:tblBorders>
+          <w:top w:val="single" w:sz="4" w:color="D9D9D9"/>
+          <w:left w:val="single" w:sz="4" w:color="D9D9D9"/>
+          <w:bottom w:val="single" w:sz="4" w:color="D9D9D9"/>
+          <w:right w:val="single" w:sz="4" w:color="D9D9D9"/>
+          <w:insideH w:val="single" w:sz="4" w:color="D9D9D9"/>
+          <w:insideV w:val="single" w:sz="4" w:color="D9D9D9"/>
+        </w:tblBorders>
+        <w:tblCellMar>
+          <w:top w:w="90" w:type="dxa"/>
+          <w:bottom w:w="90" w:type="dxa"/>
+          <w:left w:w="90" w:type="dxa"/>
+          <w:right w:w="90" w:type="dxa"/>
+        </w:tblCellMar>
       </w:tblPr>
       <w:tblGrid>
         <w:gridCol w:w="1980"/>
@@ -936,13 +1021,17 @@
       <w:tr>
         <w:trPr>
           <w:tblHeader w:val="true"/>
+          <w:cantSplit/>
         </w:trPr>
         <w:tc>
-          <w:tcPr/>
-          <w:p>
-            <w:pPr>
-              <w:pStyle w:val="Compact"/>
-              <w:jc w:val="left"/>
+          <w:tcPr>
+            <w:shd w:fill="EDEDED"/>
+          </w:tcPr>
+          <w:p>
+            <w:pPr>
+              <w:pStyle w:val="Compact"/>
+              <w:jc w:val="left"/>
+              <w:keepNext/>
             </w:pPr>
             <w:r>
               <w:t xml:space="preserve">Metric</w:t>
@@ -950,11 +1039,14 @@
           </w:p>
         </w:tc>
         <w:tc>
-          <w:tcPr/>
-          <w:p>
-            <w:pPr>
-              <w:pStyle w:val="Compact"/>
-              <w:jc w:val="left"/>
+          <w:tcPr>
+            <w:shd w:fill="EDEDED"/>
+          </w:tcPr>
+          <w:p>
+            <w:pPr>
+              <w:pStyle w:val="Compact"/>
+              <w:jc w:val="left"/>
+              <w:keepNext/>
             </w:pPr>
             <w:r>
               <w:t xml:space="preserve">Value</w:t>
@@ -962,11 +1054,14 @@
           </w:p>
         </w:tc>
         <w:tc>
-          <w:tcPr/>
-          <w:p>
-            <w:pPr>
-              <w:pStyle w:val="Compact"/>
-              <w:jc w:val="left"/>
+          <w:tcPr>
+            <w:shd w:fill="EDEDED"/>
+          </w:tcPr>
+          <w:p>
+            <w:pPr>
+              <w:pStyle w:val="Compact"/>
+              <w:jc w:val="left"/>
+              <w:keepNext/>
             </w:pPr>
             <w:r>
               <w:t xml:space="preserve">Unit</w:t>
@@ -974,11 +1069,14 @@
           </w:p>
         </w:tc>
         <w:tc>
-          <w:tcPr/>
-          <w:p>
-            <w:pPr>
-              <w:pStyle w:val="Compact"/>
-              <w:jc w:val="left"/>
+          <w:tcPr>
+            <w:shd w:fill="EDEDED"/>
+          </w:tcPr>
+          <w:p>
+            <w:pPr>
+              <w:pStyle w:val="Compact"/>
+              <w:jc w:val="left"/>
+              <w:keepNext/>
             </w:pPr>
             <w:r>
               <w:t xml:space="preserve">Source</w:t>
@@ -1041,12 +1139,15 @@
             </w:r>
           </w:p>
         </w:tc>
+        <w:trPr>
+          <w:cantSplit/>
+        </w:trPr>
       </w:tr>
     </w:tbl>
     <w:bookmarkStart w:id="24" w:name="what-the-doublet-does-to-the-flow-field"/>
     <w:p>
       <w:pPr>
-        <w:pStyle w:val="Heading3"/>
+        <w:pStyle w:val="Heading2"/>
       </w:pPr>
       <w:r>
         <w:t xml:space="preserve">4.1</w:t>
@@ -1055,9 +1156,6 @@
         <w:t xml:space="preserve"> </w:t>
       </w:r>
       <w:r>
-        <w:rPr>
-          <w:rStyle w:val="VerbatimChar"/>
-        </w:rPr>
         <w:t xml:space="preserve">&lt;What the doublet does to the flow field&gt;</w:t>
       </w:r>
     </w:p>
@@ -1076,7 +1174,7 @@
     <w:bookmarkStart w:id="25" w:name="X21fadac3bd54a724d286133375965f7e964e302"/>
     <w:p>
       <w:pPr>
-        <w:pStyle w:val="Heading3"/>
+        <w:pStyle w:val="Heading2"/>
       </w:pPr>
       <w:r>
         <w:t xml:space="preserve">4.2</w:t>
@@ -1085,9 +1183,6 @@
         <w:t xml:space="preserve"> </w:t>
       </w:r>
       <w:r>
-        <w:rPr>
-          <w:rStyle w:val="VerbatimChar"/>
-        </w:rPr>
         <w:t xml:space="preserve">&lt;What your scenario forcing adds, and where it dominates&gt;</w:t>
       </w:r>
     </w:p>
@@ -1106,7 +1201,7 @@
     <w:bookmarkStart w:id="26" w:name="what-the-water-balance-says"/>
     <w:p>
       <w:pPr>
-        <w:pStyle w:val="Heading3"/>
+        <w:pStyle w:val="Heading2"/>
       </w:pPr>
       <w:r>
         <w:t xml:space="preserve">4.3</w:t>
@@ -1115,9 +1210,6 @@
         <w:t xml:space="preserve"> </w:t>
       </w:r>
       <w:r>
-        <w:rPr>
-          <w:rStyle w:val="VerbatimChar"/>
-        </w:rPr>
         <w:t xml:space="preserve">&lt;What the water balance says&gt;</w:t>
       </w:r>
     </w:p>
@@ -1136,7 +1228,7 @@
     <w:bookmarkStart w:id="27" w:name="the-transport-verdict"/>
     <w:p>
       <w:pPr>
-        <w:pStyle w:val="Heading3"/>
+        <w:pStyle w:val="Heading2"/>
       </w:pPr>
       <w:r>
         <w:t xml:space="preserve">4.4</w:t>
@@ -1145,9 +1237,6 @@
         <w:t xml:space="preserve"> </w:t>
       </w:r>
       <w:r>
-        <w:rPr>
-          <w:rStyle w:val="VerbatimChar"/>
-        </w:rPr>
         <w:t xml:space="preserve">&lt;The transport verdict&gt;</w:t>
       </w:r>
     </w:p>
@@ -1167,7 +1256,7 @@
     <w:bookmarkStart w:id="30" w:name="X57a8af10a5f95d2fba8de300b3bb98e06c6a461"/>
     <w:p>
       <w:pPr>
-        <w:pStyle w:val="Heading2"/>
+        <w:pStyle w:val="Heading1"/>
       </w:pPr>
       <w:r>
         <w:t xml:space="preserve">5. Uncertainty and the limits of your claims</w:t>
@@ -1253,7 +1342,7 @@
     <w:bookmarkStart w:id="29" w:name="what-this-model-cannot-tell-you"/>
     <w:p>
       <w:pPr>
-        <w:pStyle w:val="Heading3"/>
+        <w:pStyle w:val="Heading2"/>
       </w:pPr>
       <w:r>
         <w:t xml:space="preserve">5.1 What this model cannot tell you</w:t>
@@ -1323,7 +1412,7 @@
     <w:bookmarkStart w:id="31" w:name="conclusion-and-practical-recommendation"/>
     <w:p>
       <w:pPr>
-        <w:pStyle w:val="Heading2"/>
+        <w:pStyle w:val="Heading1"/>
       </w:pPr>
       <w:r>
         <w:t xml:space="preserve">6. Conclusion and practical recommendation</w:t>
@@ -1410,7 +1499,7 @@
     <w:bookmarkStart w:id="32" w:name="contribution-statement"/>
     <w:p>
       <w:pPr>
-        <w:pStyle w:val="Heading2"/>
+        <w:pStyle w:val="Heading1"/>
       </w:pPr>
       <w:r>
         <w:t xml:space="preserve">7. Contribution statement</w:t>
@@ -1529,6 +1618,20 @@
         <w:tblW w:type="auto" w:w="0"/>
         <w:tblLook w:firstRow="1" w:lastRow="0" w:firstColumn="0" w:lastColumn="0" w:noHBand="0" w:noVBand="0" w:val="0020"/>
         <w:jc w:val="start"/>
+        <w:tblBorders>
+          <w:top w:val="single" w:sz="4" w:color="D9D9D9"/>
+          <w:left w:val="single" w:sz="4" w:color="D9D9D9"/>
+          <w:bottom w:val="single" w:sz="4" w:color="D9D9D9"/>
+          <w:right w:val="single" w:sz="4" w:color="D9D9D9"/>
+          <w:insideH w:val="single" w:sz="4" w:color="D9D9D9"/>
+          <w:insideV w:val="single" w:sz="4" w:color="D9D9D9"/>
+        </w:tblBorders>
+        <w:tblCellMar>
+          <w:top w:w="90" w:type="dxa"/>
+          <w:bottom w:w="90" w:type="dxa"/>
+          <w:left w:w="90" w:type="dxa"/>
+          <w:right w:w="90" w:type="dxa"/>
+        </w:tblCellMar>
       </w:tblPr>
       <w:tblGrid>
         <w:gridCol w:w="2640"/>
@@ -1538,13 +1641,17 @@
       <w:tr>
         <w:trPr>
           <w:tblHeader w:val="true"/>
+          <w:cantSplit/>
         </w:trPr>
         <w:tc>
-          <w:tcPr/>
-          <w:p>
-            <w:pPr>
-              <w:pStyle w:val="Compact"/>
-              <w:jc w:val="left"/>
+          <w:tcPr>
+            <w:shd w:fill="EDEDED"/>
+          </w:tcPr>
+          <w:p>
+            <w:pPr>
+              <w:pStyle w:val="Compact"/>
+              <w:jc w:val="left"/>
+              <w:keepNext/>
             </w:pPr>
             <w:r>
               <w:t xml:space="preserve">Member</w:t>
@@ -1552,11 +1659,14 @@
           </w:p>
         </w:tc>
         <w:tc>
-          <w:tcPr/>
-          <w:p>
-            <w:pPr>
-              <w:pStyle w:val="Compact"/>
-              <w:jc w:val="left"/>
+          <w:tcPr>
+            <w:shd w:fill="EDEDED"/>
+          </w:tcPr>
+          <w:p>
+            <w:pPr>
+              <w:pStyle w:val="Compact"/>
+              <w:jc w:val="left"/>
+              <w:keepNext/>
             </w:pPr>
             <w:r>
               <w:t xml:space="preserve">Cards</w:t>
@@ -1564,11 +1674,14 @@
           </w:p>
         </w:tc>
         <w:tc>
-          <w:tcPr/>
-          <w:p>
-            <w:pPr>
-              <w:pStyle w:val="Compact"/>
-              <w:jc w:val="left"/>
+          <w:tcPr>
+            <w:shd w:fill="EDEDED"/>
+          </w:tcPr>
+          <w:p>
+            <w:pPr>
+              <w:pStyle w:val="Compact"/>
+              <w:jc w:val="left"/>
+              <w:keepNext/>
             </w:pPr>
             <w:r>
               <w:t xml:space="preserve">Contribution</w:t>
@@ -1583,6 +1696,7 @@
             <w:pPr>
               <w:pStyle w:val="Compact"/>
               <w:jc w:val="left"/>
+              <w:keepNext/>
             </w:pPr>
             <w:r>
               <w:rPr>
@@ -1598,6 +1712,7 @@
             <w:pPr>
               <w:pStyle w:val="Compact"/>
               <w:jc w:val="left"/>
+              <w:keepNext/>
             </w:pPr>
             <w:r>
               <w:rPr>
@@ -1613,6 +1728,7 @@
             <w:pPr>
               <w:pStyle w:val="Compact"/>
               <w:jc w:val="left"/>
+              <w:keepNext/>
             </w:pPr>
             <w:r>
               <w:rPr>
@@ -1622,6 +1738,9 @@
             </w:r>
           </w:p>
         </w:tc>
+        <w:trPr>
+          <w:cantSplit/>
+        </w:trPr>
       </w:tr>
       <w:tr>
         <w:tc>
@@ -1630,6 +1749,7 @@
             <w:pPr>
               <w:pStyle w:val="Compact"/>
               <w:jc w:val="left"/>
+              <w:keepNext/>
             </w:pPr>
             <w:r>
               <w:rPr>
@@ -1645,6 +1765,7 @@
             <w:pPr>
               <w:pStyle w:val="Compact"/>
               <w:jc w:val="left"/>
+              <w:keepNext/>
             </w:pPr>
             <w:r>
               <w:rPr>
@@ -1660,6 +1781,7 @@
             <w:pPr>
               <w:pStyle w:val="Compact"/>
               <w:jc w:val="left"/>
+              <w:keepNext/>
             </w:pPr>
             <w:r>
               <w:rPr>
@@ -1669,6 +1791,9 @@
             </w:r>
           </w:p>
         </w:tc>
+        <w:trPr>
+          <w:cantSplit/>
+        </w:trPr>
       </w:tr>
       <w:tr>
         <w:tc>
@@ -1716,6 +1841,9 @@
             </w:r>
           </w:p>
         </w:tc>
+        <w:trPr>
+          <w:cantSplit/>
+        </w:trPr>
       </w:tr>
     </w:tbl>
     <w:p>
@@ -1779,7 +1907,7 @@
     <w:bookmarkStart w:id="33" w:name="references"/>
     <w:p>
       <w:pPr>
-        <w:pStyle w:val="Heading2"/>
+        <w:pStyle w:val="Heading1"/>
       </w:pPr>
       <w:r>
         <w:t xml:space="preserve">References</w:t>
@@ -1794,13 +1922,6 @@
           <w:rStyle w:val="VerbatimChar"/>
         </w:rPr>
         <w:t xml:space="preserve">&lt;...&gt;</w:t>
-      </w:r>
-    </w:p>
-    <w:p>
-      <w:r>
-        <w:pict>
-          <v:rect style="width:0;height:1.5pt" o:hralign="center" o:hrstd="t" o:hr="t"/>
-        </w:pict>
       </w:r>
     </w:p>
     <w:bookmarkEnd w:id="33"/>
@@ -1809,6 +1930,7 @@
     <w:p>
       <w:pPr>
         <w:pStyle w:val="Heading1"/>
+        <w:pageBreakBefore/>
       </w:pPr>
       <w:r>
         <w:t xml:space="preserve">Appendix</w:t>
@@ -1835,7 +1957,7 @@
     <w:bookmarkStart w:id="35" w:name="a.-figure-and-table-index"/>
     <w:p>
       <w:pPr>
-        <w:pStyle w:val="Heading2"/>
+        <w:pStyle w:val="Heading1"/>
       </w:pPr>
       <w:r>
         <w:t xml:space="preserve">A. Figure and table index</w:t>
@@ -1847,6 +1969,20 @@
         <w:tblW w:type="auto" w:w="0"/>
         <w:tblLook w:firstRow="1" w:lastRow="0" w:firstColumn="0" w:lastColumn="0" w:noHBand="0" w:noVBand="0" w:val="0020"/>
         <w:jc w:val="start"/>
+        <w:tblBorders>
+          <w:top w:val="single" w:sz="4" w:color="D9D9D9"/>
+          <w:left w:val="single" w:sz="4" w:color="D9D9D9"/>
+          <w:bottom w:val="single" w:sz="4" w:color="D9D9D9"/>
+          <w:right w:val="single" w:sz="4" w:color="D9D9D9"/>
+          <w:insideH w:val="single" w:sz="4" w:color="D9D9D9"/>
+          <w:insideV w:val="single" w:sz="4" w:color="D9D9D9"/>
+        </w:tblBorders>
+        <w:tblCellMar>
+          <w:top w:w="90" w:type="dxa"/>
+          <w:bottom w:w="90" w:type="dxa"/>
+          <w:left w:w="90" w:type="dxa"/>
+          <w:right w:w="90" w:type="dxa"/>
+        </w:tblCellMar>
       </w:tblPr>
       <w:tblGrid>
         <w:gridCol w:w="3960"/>
@@ -1855,13 +1991,17 @@
       <w:tr>
         <w:trPr>
           <w:tblHeader w:val="true"/>
+          <w:cantSplit/>
         </w:trPr>
         <w:tc>
-          <w:tcPr/>
-          <w:p>
-            <w:pPr>
-              <w:pStyle w:val="Compact"/>
-              <w:jc w:val="left"/>
+          <w:tcPr>
+            <w:shd w:fill="EDEDED"/>
+          </w:tcPr>
+          <w:p>
+            <w:pPr>
+              <w:pStyle w:val="Compact"/>
+              <w:jc w:val="left"/>
+              <w:keepNext/>
             </w:pPr>
             <w:r>
               <w:t xml:space="preserve">Report item</w:t>
@@ -1869,11 +2009,14 @@
           </w:p>
         </w:tc>
         <w:tc>
-          <w:tcPr/>
-          <w:p>
-            <w:pPr>
-              <w:pStyle w:val="Compact"/>
-              <w:jc w:val="left"/>
+          <w:tcPr>
+            <w:shd w:fill="EDEDED"/>
+          </w:tcPr>
+          <w:p>
+            <w:pPr>
+              <w:pStyle w:val="Compact"/>
+              <w:jc w:val="left"/>
+              <w:keepNext/>
             </w:pPr>
             <w:r>
               <w:t xml:space="preserve">File</w:t>
@@ -1888,6 +2031,7 @@
             <w:pPr>
               <w:pStyle w:val="Compact"/>
               <w:jc w:val="left"/>
+              <w:keepNext/>
             </w:pPr>
             <w:r>
               <w:t xml:space="preserve">Figure 1</w:t>
@@ -1900,6 +2044,7 @@
             <w:pPr>
               <w:pStyle w:val="Compact"/>
               <w:jc w:val="left"/>
+              <w:keepNext/>
             </w:pPr>
             <w:r>
               <w:rPr>
@@ -1909,6 +2054,9 @@
             </w:r>
           </w:p>
         </w:tc>
+        <w:trPr>
+          <w:cantSplit/>
+        </w:trPr>
       </w:tr>
       <w:tr>
         <w:tc>
@@ -1938,13 +2086,16 @@
             </w:r>
           </w:p>
         </w:tc>
+        <w:trPr>
+          <w:cantSplit/>
+        </w:trPr>
       </w:tr>
     </w:tbl>
     <w:bookmarkEnd w:id="35"/>
     <w:bookmarkStart w:id="36" w:name="X0585afa711488b73644bf3eb0145c93e45a4801"/>
     <w:p>
       <w:pPr>
-        <w:pStyle w:val="Heading2"/>
+        <w:pStyle w:val="Heading1"/>
       </w:pPr>
       <w:r>
         <w:t xml:space="preserve">B.</w:t>
@@ -1953,9 +2104,6 @@
         <w:t xml:space="preserve"> </w:t>
       </w:r>
       <w:r>
-        <w:rPr>
-          <w:rStyle w:val="VerbatimChar"/>
-        </w:rPr>
         <w:t xml:space="preserve">&lt;Derivations or intermediate numbers you want on record&gt;</w:t>
       </w:r>
     </w:p>
@@ -1972,7 +2120,10 @@
     </w:p>
     <w:bookmarkEnd w:id="36"/>
     <w:bookmarkEnd w:id="37"/>
-    <w:sectPr/>
+    <w:sectPr>
+      <w:pgSz w:w="11906" w:h="16838"/>
+      <w:pgMar w:top="1417" w:bottom="1417" w:left="1417" w:right="1417"/>
+    </w:sectPr>
   </w:body>
 </w:document>
 </file>
@@ -2085,7 +2236,7 @@
 </file>
 
 <file path=word/styles.xml><?xml version="1.0" encoding="utf-8"?>
-<w:styles xmlns:r="http://schemas.openxmlformats.org/officeDocument/2006/relationships" xmlns:w="http://schemas.openxmlformats.org/wordprocessingml/2006/main">
+<w:styles xmlns:w="http://schemas.openxmlformats.org/wordprocessingml/2006/main">
   <w:docDefaults>
     <w:rPrDefault>
       <w:rPr>
@@ -2105,21 +2256,45 @@
   <w:style w:default="1" w:styleId="Normal" w:type="paragraph">
     <w:name w:val="Normal"/>
     <w:qFormat/>
+    <w:rPr>
+      <w:rFonts w:ascii="Calibri" w:hAnsi="Calibri" w:cs="Calibri"/>
+      <w:sz w:val="22"/>
+      <w:szCs w:val="22"/>
+      <w:color w:val="000000"/>
+    </w:rPr>
+    <w:pPr>
+      <w:spacing w:after="120" w:line="264" w:lineRule="auto"/>
+    </w:pPr>
   </w:style>
   <w:style w:styleId="BodyText" w:type="paragraph">
     <w:name w:val="Body Text"/>
     <w:basedOn w:val="Normal"/>
     <w:link w:val="BodyTextChar"/>
     <w:pPr>
-      <w:spacing w:after="180" w:before="180"/>
+      <w:spacing w:after="120" w:before="180" w:line="264" w:lineRule="auto"/>
     </w:pPr>
     <w:qFormat/>
+    <w:rPr>
+      <w:rFonts w:ascii="Calibri" w:hAnsi="Calibri" w:cs="Calibri"/>
+      <w:sz w:val="22"/>
+      <w:szCs w:val="22"/>
+      <w:color w:val="000000"/>
+    </w:rPr>
   </w:style>
   <w:style w:customStyle="1" w:styleId="FirstParagraph" w:type="paragraph">
     <w:name w:val="First Paragraph"/>
     <w:basedOn w:val="BodyText"/>
     <w:next w:val="BodyText"/>
     <w:qFormat/>
+    <w:rPr>
+      <w:rFonts w:ascii="Calibri" w:hAnsi="Calibri" w:cs="Calibri"/>
+      <w:sz w:val="22"/>
+      <w:szCs w:val="22"/>
+      <w:color w:val="000000"/>
+    </w:rPr>
+    <w:pPr>
+      <w:spacing w:after="120" w:line="264" w:lineRule="auto"/>
+    </w:pPr>
   </w:style>
   <w:style w:customStyle="1" w:styleId="Compact" w:type="paragraph">
     <w:name w:val="Compact"/>
@@ -2137,16 +2312,16 @@
     <w:pPr>
       <w:keepNext/>
       <w:keepLines/>
-      <w:spacing w:after="240" w:before="480"/>
+      <w:spacing w:after="120" w:before="240" w:line="264" w:lineRule="auto"/>
       <w:jc w:val="center"/>
     </w:pPr>
     <w:rPr>
-      <w:rFonts w:asciiTheme="majorHAnsi" w:cstheme="majorBidi" w:eastAsiaTheme="majorEastAsia" w:hAnsiTheme="majorHAnsi"/>
+      <w:rFonts w:asciiTheme="majorHAnsi" w:cstheme="majorBidi" w:eastAsiaTheme="majorEastAsia" w:hAnsiTheme="majorHAnsi" w:ascii="Calibri" w:hAnsi="Calibri" w:cs="Calibri"/>
       <w:b/>
       <w:bCs/>
-      <w:color w:themeColor="accent1" w:themeShade="B5" w:val="345A8A"/>
-      <w:sz w:val="36"/>
-      <w:szCs w:val="36"/>
+      <w:color w:val="000000"/>
+      <w:sz w:val="52"/>
+      <w:szCs w:val="52"/>
     </w:rPr>
   </w:style>
   <w:style w:styleId="Subtitle" w:type="paragraph">
@@ -2236,14 +2411,14 @@
     <w:pPr>
       <w:keepNext/>
       <w:keepLines/>
-      <w:spacing w:after="0" w:before="480"/>
+      <w:spacing w:after="120" w:before="240" w:line="264" w:lineRule="auto"/>
       <w:outlineLvl w:val="0"/>
     </w:pPr>
     <w:rPr>
-      <w:rFonts w:asciiTheme="majorHAnsi" w:cstheme="majorBidi" w:eastAsiaTheme="majorEastAsia" w:hAnsiTheme="majorHAnsi"/>
+      <w:rFonts w:asciiTheme="majorHAnsi" w:cstheme="majorBidi" w:eastAsiaTheme="majorEastAsia" w:hAnsiTheme="majorHAnsi" w:ascii="Calibri" w:hAnsi="Calibri" w:cs="Calibri"/>
       <w:b/>
       <w:bCs/>
-      <w:color w:themeColor="accent1" w:val="4F81BD"/>
+      <w:color w:val="000000"/>
       <w:sz w:val="32"/>
       <w:szCs w:val="32"/>
     </w:rPr>
@@ -2258,16 +2433,16 @@
     <w:pPr>
       <w:keepNext/>
       <w:keepLines/>
-      <w:spacing w:after="0" w:before="200"/>
+      <w:spacing w:after="120" w:before="240" w:line="264" w:lineRule="auto"/>
       <w:outlineLvl w:val="1"/>
     </w:pPr>
     <w:rPr>
-      <w:rFonts w:asciiTheme="majorHAnsi" w:cstheme="majorBidi" w:eastAsiaTheme="majorEastAsia" w:hAnsiTheme="majorHAnsi"/>
+      <w:rFonts w:asciiTheme="majorHAnsi" w:cstheme="majorBidi" w:eastAsiaTheme="majorEastAsia" w:hAnsiTheme="majorHAnsi" w:ascii="Calibri" w:hAnsi="Calibri" w:cs="Calibri"/>
       <w:b/>
       <w:bCs/>
-      <w:color w:themeColor="accent1" w:val="4F81BD"/>
-      <w:sz w:val="28"/>
-      <w:szCs w:val="28"/>
+      <w:color w:val="000000"/>
+      <w:sz w:val="26"/>
+      <w:szCs w:val="26"/>
     </w:rPr>
   </w:style>
   <w:style w:styleId="Heading3" w:type="paragraph">
@@ -2280,14 +2455,14 @@
     <w:pPr>
       <w:keepNext/>
       <w:keepLines/>
-      <w:spacing w:after="0" w:before="200"/>
+      <w:spacing w:after="120" w:before="240" w:line="264" w:lineRule="auto"/>
       <w:outlineLvl w:val="2"/>
     </w:pPr>
     <w:rPr>
-      <w:rFonts w:asciiTheme="majorHAnsi" w:cstheme="majorBidi" w:eastAsiaTheme="majorEastAsia" w:hAnsiTheme="majorHAnsi"/>
+      <w:rFonts w:asciiTheme="majorHAnsi" w:cstheme="majorBidi" w:eastAsiaTheme="majorEastAsia" w:hAnsiTheme="majorHAnsi" w:ascii="Calibri" w:hAnsi="Calibri" w:cs="Calibri"/>
       <w:b/>
       <w:bCs/>
-      <w:color w:themeColor="accent1" w:val="4F81BD"/>
+      <w:color w:val="000000"/>
       <w:sz w:val="24"/>
       <w:szCs w:val="24"/>
     </w:rPr>
@@ -2423,9 +2598,16 @@
     <w:unhideWhenUsed/>
     <w:qFormat/>
     <w:pPr>
-      <w:spacing w:after="100" w:before="100"/>
-      <w:ind w:firstLine="0" w:left="480" w:right="480"/>
+      <w:spacing w:after="120" w:before="100" w:line="264" w:lineRule="auto"/>
+      <w:ind w:firstLine="0" w:left="0" w:right="0"/>
+      <w:keepLines/>
     </w:pPr>
+    <w:rPr>
+      <w:rFonts w:ascii="Calibri" w:hAnsi="Calibri" w:cs="Calibri"/>
+      <w:sz w:val="20"/>
+      <w:szCs w:val="20"/>
+      <w:color w:val="000000"/>
+    </w:rPr>
   </w:style>
   <w:style w:styleId="FootnoteText" w:type="paragraph">
     <w:name w:val="Footnote Text"/>
@@ -2530,9 +2712,14 @@
     <w:name w:val="Verbatim Char"/>
     <w:basedOn w:val="BodyTextChar"/>
     <w:rPr>
-      <w:rFonts w:ascii="Consolas" w:hAnsi="Consolas"/>
-      <w:sz w:val="22"/>
-    </w:rPr>
+      <w:rFonts w:ascii="Calibri" w:hAnsi="Calibri" w:cs="Calibri"/>
+      <w:sz w:val="20"/>
+      <w:szCs w:val="20"/>
+      <w:color w:val="000000"/>
+    </w:rPr>
+    <w:pPr>
+      <w:spacing w:after="120" w:line="264" w:lineRule="auto"/>
+    </w:pPr>
   </w:style>
   <w:style w:customStyle="1" w:styleId="SectionNumber" w:type="character">
     <w:name w:val="Section Number"/>

</xml_diff>